<commit_message>
Bürgeramt Athen: stummes Schaubild zeigt direkt, was jede Klasse darf
Ankreuzrechte pro Klasse (abstimmen, klagen, in den Rat, Archont werden),
Pfeile zu den Ämtern; Folien 8–9 und Handreichung angepasst.

Co-Authored-By: Claude Opus 5.5 <noreply@anthropic.com>
Claude-Session: https://claude.ai/code/session_013iN4Tiarea1J9YUJHZ9iqC
</commit_message>
<xml_diff>
--- a/Geschichte_11/Stunde_Buergeramt_Athen/Stummes_Schaubild_A5.docx
+++ b/Geschichte_11/Stunde_Buergeramt_Athen/Stummes_Schaubild_A5.docx
@@ -94,7 +94,7 @@
                 <w:sz w:val="17"/>
                 <w:szCs w:val="17"/>
               </w:rPr>
-              <w:t xml:space="preserve">Buch und Heft bleiben zu! Das Schaubild ist anders angeordnet als im Buch.</w:t>
+              <w:t xml:space="preserve">Buch und Hefter bleiben zu! Wer darf was?</w:t>
             </w:r>
           </w:p>
           <w:p>
@@ -105,7 +105,7 @@
             <w:r>
               <w:drawing>
                 <wp:inline distT="0" distB="0" distL="0" distR="0">
-                  <wp:extent cx="4572000" cy="3600450"/>
+                  <wp:extent cx="4572000" cy="3086100"/>
                   <wp:effectExtent t="0" r="0" b="0" l="0"/>
                   <wp:docPr id="1" name="" descr="" title=""/>
                   <wp:cNvGraphicFramePr>
@@ -130,7 +130,7 @@
                         <pic:spPr bwMode="auto">
                           <a:xfrm>
                             <a:off x="0" y="0"/>
-                            <a:ext cx="4572000" cy="3600450"/>
+                            <a:ext cx="4572000" cy="3086100"/>
                           </a:xfrm>
                           <a:prstGeom prst="rect">
                             <a:avLst/>
@@ -226,7 +226,7 @@
                 <w:sz w:val="19"/>
                 <w:szCs w:val="19"/>
               </w:rPr>
-              <w:t xml:space="preserve">Trage die Begriffe in die Kästen ein und ergänze die Überschrift links.</w:t>
+              <w:t xml:space="preserve">Beschrifte die vier Ämter oben, die Volksversammlung und die vier Klassen (mit Scheffelgrenze).</w:t>
             </w:r>
           </w:p>
           <w:p>
@@ -251,7 +251,57 @@
                 <w:sz w:val="19"/>
                 <w:szCs w:val="19"/>
               </w:rPr>
-              <w:t xml:space="preserve">Schreibe auf, was die Pfeile 1–5 bedeuten (z. B. „wählt“, „kann gewählt werden“).</w:t>
+              <w:t xml:space="preserve">Kreuze bei jeder Klasse an, was sie darf. Was sie nicht darf, streichst du rot durch.</w:t>
+            </w:r>
+          </w:p>
+          <w:p>
+            <w:pPr>
+              <w:spacing w:after="30" w:before="0"/>
+            </w:pPr>
+            <w:r>
+              <w:rPr>
+                <w:rFonts w:ascii="Calibri" w:cs="Calibri" w:eastAsia="Calibri" w:hAnsi="Calibri"/>
+                <w:b/>
+                <w:bCs/>
+                <w:color w:val="AD4426"/>
+                <w:sz w:val="19"/>
+                <w:szCs w:val="19"/>
+              </w:rPr>
+              <w:t xml:space="preserve">3. </w:t>
+            </w:r>
+            <w:r>
+              <w:rPr>
+                <w:rFonts w:ascii="Calibri" w:cs="Calibri" w:eastAsia="Calibri" w:hAnsi="Calibri"/>
+                <w:color w:val="2B2318"/>
+                <w:sz w:val="19"/>
+                <w:szCs w:val="19"/>
+              </w:rPr>
+              <w:t xml:space="preserve">Zeichne Pfeile von jeder Klasse zu den Ämtern, in die sie gewählt werden kann.</w:t>
+            </w:r>
+          </w:p>
+          <w:p>
+            <w:pPr>
+              <w:spacing w:after="0" w:before="0"/>
+            </w:pPr>
+            <w:r>
+              <w:rPr>
+                <w:rFonts w:ascii="Calibri" w:cs="Calibri" w:eastAsia="Calibri" w:hAnsi="Calibri"/>
+                <w:b/>
+                <w:bCs/>
+                <w:color w:val="AD4426"/>
+                <w:sz w:val="19"/>
+                <w:szCs w:val="19"/>
+              </w:rPr>
+              <w:t xml:space="preserve">4. </w:t>
+            </w:r>
+            <w:r>
+              <w:rPr>
+                <w:rFonts w:ascii="Calibri" w:cs="Calibri" w:eastAsia="Calibri" w:hAnsi="Calibri"/>
+                <w:color w:val="2B2318"/>
+                <w:sz w:val="19"/>
+                <w:szCs w:val="19"/>
+              </w:rPr>
+              <w:t xml:space="preserve">Wer darf gar nichts?</w:t>
             </w:r>
           </w:p>
           <w:tbl>
@@ -267,239 +317,27 @@
               </w:tblBorders>
             </w:tblPr>
             <w:tblGrid>
-              <w:gridCol w:w="3590"/>
-              <w:gridCol w:w="3590"/>
+              <w:gridCol w:w="7180"/>
             </w:tblGrid>
             <w:tr>
+              <w:trPr>
+                <w:trHeight w:val="380" w:hRule="exact"/>
+              </w:trPr>
               <w:tc>
                 <w:tcPr>
-                  <w:tcW w:type="dxa" w:w="3590"/>
+                  <w:tcW w:type="dxa" w:w="7180"/>
                   <w:tcBorders>
                     <w:top w:val="none" w:color="FFFFFF" w:sz="0"/>
                     <w:left w:val="none" w:color="FFFFFF" w:sz="0"/>
                     <w:bottom w:val="single" w:color="BFB5A5" w:sz="4"/>
                     <w:right w:val="none" w:color="FFFFFF" w:sz="0"/>
                   </w:tcBorders>
-                  <w:tcMar>
-                    <w:top w:type="dxa" w:w="90"/>
-                    <w:left w:type="dxa" w:w="40"/>
-                    <w:bottom w:type="dxa" w:w="30"/>
-                    <w:right w:type="dxa" w:w="40"/>
-                  </w:tcMar>
                 </w:tcPr>
-                <w:p>
-                  <w:pPr>
-                    <w:spacing w:after="0" w:before="0"/>
-                  </w:pPr>
-                  <w:r>
-                    <w:rPr>
-                      <w:rFonts w:ascii="Calibri" w:cs="Calibri" w:eastAsia="Calibri" w:hAnsi="Calibri"/>
-                      <w:b/>
-                      <w:bCs/>
-                      <w:color w:val="AD4426"/>
-                      <w:sz w:val="19"/>
-                      <w:szCs w:val="19"/>
-                    </w:rPr>
-                    <w:t xml:space="preserve">Pfeil 1:</w:t>
-                  </w:r>
-                </w:p>
-              </w:tc>
-              <w:tc>
-                <w:tcPr>
-                  <w:tcW w:type="dxa" w:w="3590"/>
-                  <w:tcBorders>
-                    <w:top w:val="none" w:color="FFFFFF" w:sz="0"/>
-                    <w:left w:val="none" w:color="FFFFFF" w:sz="0"/>
-                    <w:bottom w:val="single" w:color="BFB5A5" w:sz="4"/>
-                    <w:right w:val="none" w:color="FFFFFF" w:sz="0"/>
-                  </w:tcBorders>
-                  <w:tcMar>
-                    <w:top w:type="dxa" w:w="90"/>
-                    <w:left w:type="dxa" w:w="40"/>
-                    <w:bottom w:type="dxa" w:w="30"/>
-                    <w:right w:type="dxa" w:w="40"/>
-                  </w:tcMar>
-                </w:tcPr>
-                <w:p>
-                  <w:pPr>
-                    <w:spacing w:after="0" w:before="0"/>
-                  </w:pPr>
-                  <w:r>
-                    <w:rPr>
-                      <w:rFonts w:ascii="Calibri" w:cs="Calibri" w:eastAsia="Calibri" w:hAnsi="Calibri"/>
-                      <w:b/>
-                      <w:bCs/>
-                      <w:color w:val="AD4426"/>
-                      <w:sz w:val="19"/>
-                      <w:szCs w:val="19"/>
-                    </w:rPr>
-                    <w:t xml:space="preserve">Pfeil 2:</w:t>
-                  </w:r>
-                </w:p>
-              </w:tc>
-            </w:tr>
-            <w:tr>
-              <w:tc>
-                <w:tcPr>
-                  <w:tcW w:type="dxa" w:w="3590"/>
-                  <w:tcBorders>
-                    <w:top w:val="none" w:color="FFFFFF" w:sz="0"/>
-                    <w:left w:val="none" w:color="FFFFFF" w:sz="0"/>
-                    <w:bottom w:val="single" w:color="BFB5A5" w:sz="4"/>
-                    <w:right w:val="none" w:color="FFFFFF" w:sz="0"/>
-                  </w:tcBorders>
-                  <w:tcMar>
-                    <w:top w:type="dxa" w:w="90"/>
-                    <w:left w:type="dxa" w:w="40"/>
-                    <w:bottom w:type="dxa" w:w="30"/>
-                    <w:right w:type="dxa" w:w="40"/>
-                  </w:tcMar>
-                </w:tcPr>
-                <w:p>
-                  <w:pPr>
-                    <w:spacing w:after="0" w:before="0"/>
-                  </w:pPr>
-                  <w:r>
-                    <w:rPr>
-                      <w:rFonts w:ascii="Calibri" w:cs="Calibri" w:eastAsia="Calibri" w:hAnsi="Calibri"/>
-                      <w:b/>
-                      <w:bCs/>
-                      <w:color w:val="AD4426"/>
-                      <w:sz w:val="19"/>
-                      <w:szCs w:val="19"/>
-                    </w:rPr>
-                    <w:t xml:space="preserve">Pfeil 3:</w:t>
-                  </w:r>
-                </w:p>
-              </w:tc>
-              <w:tc>
-                <w:tcPr>
-                  <w:tcW w:type="dxa" w:w="3590"/>
-                  <w:tcBorders>
-                    <w:top w:val="none" w:color="FFFFFF" w:sz="0"/>
-                    <w:left w:val="none" w:color="FFFFFF" w:sz="0"/>
-                    <w:bottom w:val="single" w:color="BFB5A5" w:sz="4"/>
-                    <w:right w:val="none" w:color="FFFFFF" w:sz="0"/>
-                  </w:tcBorders>
-                  <w:tcMar>
-                    <w:top w:type="dxa" w:w="90"/>
-                    <w:left w:type="dxa" w:w="40"/>
-                    <w:bottom w:type="dxa" w:w="30"/>
-                    <w:right w:type="dxa" w:w="40"/>
-                  </w:tcMar>
-                </w:tcPr>
-                <w:p>
-                  <w:pPr>
-                    <w:spacing w:after="0" w:before="0"/>
-                  </w:pPr>
-                  <w:r>
-                    <w:rPr>
-                      <w:rFonts w:ascii="Calibri" w:cs="Calibri" w:eastAsia="Calibri" w:hAnsi="Calibri"/>
-                      <w:b/>
-                      <w:bCs/>
-                      <w:color w:val="AD4426"/>
-                      <w:sz w:val="19"/>
-                      <w:szCs w:val="19"/>
-                    </w:rPr>
-                    <w:t xml:space="preserve">Pfeil 4:</w:t>
-                  </w:r>
-                </w:p>
-              </w:tc>
-            </w:tr>
-            <w:tr>
-              <w:tc>
-                <w:tcPr>
-                  <w:tcW w:type="dxa" w:w="3590"/>
-                  <w:tcBorders>
-                    <w:top w:val="none" w:color="FFFFFF" w:sz="0"/>
-                    <w:left w:val="none" w:color="FFFFFF" w:sz="0"/>
-                    <w:bottom w:val="single" w:color="BFB5A5" w:sz="4"/>
-                    <w:right w:val="none" w:color="FFFFFF" w:sz="0"/>
-                  </w:tcBorders>
-                  <w:tcMar>
-                    <w:top w:type="dxa" w:w="90"/>
-                    <w:left w:type="dxa" w:w="40"/>
-                    <w:bottom w:type="dxa" w:w="30"/>
-                    <w:right w:type="dxa" w:w="40"/>
-                  </w:tcMar>
-                </w:tcPr>
-                <w:p>
-                  <w:pPr>
-                    <w:spacing w:after="0" w:before="0"/>
-                  </w:pPr>
-                  <w:r>
-                    <w:rPr>
-                      <w:rFonts w:ascii="Calibri" w:cs="Calibri" w:eastAsia="Calibri" w:hAnsi="Calibri"/>
-                      <w:b/>
-                      <w:bCs/>
-                      <w:color w:val="AD4426"/>
-                      <w:sz w:val="19"/>
-                      <w:szCs w:val="19"/>
-                    </w:rPr>
-                    <w:t xml:space="preserve">Pfeil 5:</w:t>
-                  </w:r>
-                </w:p>
-              </w:tc>
-              <w:tc>
-                <w:tcPr>
-                  <w:tcW w:type="dxa" w:w="3590"/>
-                  <w:tcBorders>
-                    <w:top w:val="none" w:color="FFFFFF" w:sz="0"/>
-                    <w:left w:val="none" w:color="FFFFFF" w:sz="0"/>
-                    <w:bottom w:val="single" w:color="BFB5A5" w:sz="4"/>
-                    <w:right w:val="none" w:color="FFFFFF" w:sz="0"/>
-                  </w:tcBorders>
-                  <w:tcMar>
-                    <w:top w:type="dxa" w:w="90"/>
-                    <w:left w:type="dxa" w:w="40"/>
-                    <w:bottom w:type="dxa" w:w="30"/>
-                    <w:right w:type="dxa" w:w="40"/>
-                  </w:tcMar>
-                </w:tcPr>
-                <w:p>
-                  <w:pPr>
-                    <w:spacing w:after="0" w:before="0"/>
-                  </w:pPr>
-                  <w:r>
-                    <w:rPr>
-                      <w:rFonts w:ascii="Calibri" w:cs="Calibri" w:eastAsia="Calibri" w:hAnsi="Calibri"/>
-                      <w:b/>
-                      <w:bCs/>
-                      <w:color w:val="AD4426"/>
-                      <w:sz w:val="19"/>
-                      <w:szCs w:val="19"/>
-                    </w:rPr>
-                    <w:t xml:space="preserve"/>
-                  </w:r>
-                </w:p>
+                <w:p/>
               </w:tc>
             </w:tr>
           </w:tbl>
-          <w:p>
-            <w:pPr>
-              <w:spacing w:after="0" w:before="100"/>
-            </w:pPr>
-            <w:r>
-              <w:rPr>
-                <w:rFonts w:ascii="Calibri" w:cs="Calibri" w:eastAsia="Calibri" w:hAnsi="Calibri"/>
-                <w:b/>
-                <w:bCs/>
-                <w:color w:val="AD4426"/>
-                <w:sz w:val="19"/>
-                <w:szCs w:val="19"/>
-              </w:rPr>
-              <w:t xml:space="preserve">3. </w:t>
-            </w:r>
-            <w:r>
-              <w:rPr>
-                <w:rFonts w:ascii="Calibri" w:cs="Calibri" w:eastAsia="Calibri" w:hAnsi="Calibri"/>
-                <w:color w:val="2B2318"/>
-                <w:sz w:val="19"/>
-                <w:szCs w:val="19"/>
-              </w:rPr>
-              <w:t xml:space="preserve">Lykon ist Thete: Kreise grün ein, was er darf. Streiche rot durch, was er nicht darf.</w:t>
-            </w:r>
-          </w:p>
+          <w:p/>
         </w:tc>
         <w:tc>
           <w:tcPr>
@@ -576,7 +414,7 @@
                 <w:sz w:val="17"/>
                 <w:szCs w:val="17"/>
               </w:rPr>
-              <w:t xml:space="preserve">Buch und Heft bleiben zu! Das Schaubild ist anders angeordnet als im Buch.</w:t>
+              <w:t xml:space="preserve">Buch und Hefter bleiben zu! Wer darf was?</w:t>
             </w:r>
           </w:p>
           <w:p>
@@ -587,7 +425,7 @@
             <w:r>
               <w:drawing>
                 <wp:inline distT="0" distB="0" distL="0" distR="0">
-                  <wp:extent cx="4572000" cy="3600450"/>
+                  <wp:extent cx="4572000" cy="3086100"/>
                   <wp:effectExtent t="0" r="0" b="0" l="0"/>
                   <wp:docPr id="1" name="" descr="" title=""/>
                   <wp:cNvGraphicFramePr>
@@ -612,7 +450,7 @@
                         <pic:spPr bwMode="auto">
                           <a:xfrm>
                             <a:off x="0" y="0"/>
-                            <a:ext cx="4572000" cy="3600450"/>
+                            <a:ext cx="4572000" cy="3086100"/>
                           </a:xfrm>
                           <a:prstGeom prst="rect">
                             <a:avLst/>
@@ -708,7 +546,7 @@
                 <w:sz w:val="19"/>
                 <w:szCs w:val="19"/>
               </w:rPr>
-              <w:t xml:space="preserve">Trage die Begriffe in die Kästen ein und ergänze die Überschrift links.</w:t>
+              <w:t xml:space="preserve">Beschrifte die vier Ämter oben, die Volksversammlung und die vier Klassen (mit Scheffelgrenze).</w:t>
             </w:r>
           </w:p>
           <w:p>
@@ -733,7 +571,57 @@
                 <w:sz w:val="19"/>
                 <w:szCs w:val="19"/>
               </w:rPr>
-              <w:t xml:space="preserve">Schreibe auf, was die Pfeile 1–5 bedeuten (z. B. „wählt“, „kann gewählt werden“).</w:t>
+              <w:t xml:space="preserve">Kreuze bei jeder Klasse an, was sie darf. Was sie nicht darf, streichst du rot durch.</w:t>
+            </w:r>
+          </w:p>
+          <w:p>
+            <w:pPr>
+              <w:spacing w:after="30" w:before="0"/>
+            </w:pPr>
+            <w:r>
+              <w:rPr>
+                <w:rFonts w:ascii="Calibri" w:cs="Calibri" w:eastAsia="Calibri" w:hAnsi="Calibri"/>
+                <w:b/>
+                <w:bCs/>
+                <w:color w:val="AD4426"/>
+                <w:sz w:val="19"/>
+                <w:szCs w:val="19"/>
+              </w:rPr>
+              <w:t xml:space="preserve">3. </w:t>
+            </w:r>
+            <w:r>
+              <w:rPr>
+                <w:rFonts w:ascii="Calibri" w:cs="Calibri" w:eastAsia="Calibri" w:hAnsi="Calibri"/>
+                <w:color w:val="2B2318"/>
+                <w:sz w:val="19"/>
+                <w:szCs w:val="19"/>
+              </w:rPr>
+              <w:t xml:space="preserve">Zeichne Pfeile von jeder Klasse zu den Ämtern, in die sie gewählt werden kann.</w:t>
+            </w:r>
+          </w:p>
+          <w:p>
+            <w:pPr>
+              <w:spacing w:after="0" w:before="0"/>
+            </w:pPr>
+            <w:r>
+              <w:rPr>
+                <w:rFonts w:ascii="Calibri" w:cs="Calibri" w:eastAsia="Calibri" w:hAnsi="Calibri"/>
+                <w:b/>
+                <w:bCs/>
+                <w:color w:val="AD4426"/>
+                <w:sz w:val="19"/>
+                <w:szCs w:val="19"/>
+              </w:rPr>
+              <w:t xml:space="preserve">4. </w:t>
+            </w:r>
+            <w:r>
+              <w:rPr>
+                <w:rFonts w:ascii="Calibri" w:cs="Calibri" w:eastAsia="Calibri" w:hAnsi="Calibri"/>
+                <w:color w:val="2B2318"/>
+                <w:sz w:val="19"/>
+                <w:szCs w:val="19"/>
+              </w:rPr>
+              <w:t xml:space="preserve">Wer darf gar nichts?</w:t>
             </w:r>
           </w:p>
           <w:tbl>
@@ -749,239 +637,27 @@
               </w:tblBorders>
             </w:tblPr>
             <w:tblGrid>
-              <w:gridCol w:w="3590"/>
-              <w:gridCol w:w="3590"/>
+              <w:gridCol w:w="7180"/>
             </w:tblGrid>
             <w:tr>
+              <w:trPr>
+                <w:trHeight w:val="380" w:hRule="exact"/>
+              </w:trPr>
               <w:tc>
                 <w:tcPr>
-                  <w:tcW w:type="dxa" w:w="3590"/>
+                  <w:tcW w:type="dxa" w:w="7180"/>
                   <w:tcBorders>
                     <w:top w:val="none" w:color="FFFFFF" w:sz="0"/>
                     <w:left w:val="none" w:color="FFFFFF" w:sz="0"/>
                     <w:bottom w:val="single" w:color="BFB5A5" w:sz="4"/>
                     <w:right w:val="none" w:color="FFFFFF" w:sz="0"/>
                   </w:tcBorders>
-                  <w:tcMar>
-                    <w:top w:type="dxa" w:w="90"/>
-                    <w:left w:type="dxa" w:w="40"/>
-                    <w:bottom w:type="dxa" w:w="30"/>
-                    <w:right w:type="dxa" w:w="40"/>
-                  </w:tcMar>
                 </w:tcPr>
-                <w:p>
-                  <w:pPr>
-                    <w:spacing w:after="0" w:before="0"/>
-                  </w:pPr>
-                  <w:r>
-                    <w:rPr>
-                      <w:rFonts w:ascii="Calibri" w:cs="Calibri" w:eastAsia="Calibri" w:hAnsi="Calibri"/>
-                      <w:b/>
-                      <w:bCs/>
-                      <w:color w:val="AD4426"/>
-                      <w:sz w:val="19"/>
-                      <w:szCs w:val="19"/>
-                    </w:rPr>
-                    <w:t xml:space="preserve">Pfeil 1:</w:t>
-                  </w:r>
-                </w:p>
-              </w:tc>
-              <w:tc>
-                <w:tcPr>
-                  <w:tcW w:type="dxa" w:w="3590"/>
-                  <w:tcBorders>
-                    <w:top w:val="none" w:color="FFFFFF" w:sz="0"/>
-                    <w:left w:val="none" w:color="FFFFFF" w:sz="0"/>
-                    <w:bottom w:val="single" w:color="BFB5A5" w:sz="4"/>
-                    <w:right w:val="none" w:color="FFFFFF" w:sz="0"/>
-                  </w:tcBorders>
-                  <w:tcMar>
-                    <w:top w:type="dxa" w:w="90"/>
-                    <w:left w:type="dxa" w:w="40"/>
-                    <w:bottom w:type="dxa" w:w="30"/>
-                    <w:right w:type="dxa" w:w="40"/>
-                  </w:tcMar>
-                </w:tcPr>
-                <w:p>
-                  <w:pPr>
-                    <w:spacing w:after="0" w:before="0"/>
-                  </w:pPr>
-                  <w:r>
-                    <w:rPr>
-                      <w:rFonts w:ascii="Calibri" w:cs="Calibri" w:eastAsia="Calibri" w:hAnsi="Calibri"/>
-                      <w:b/>
-                      <w:bCs/>
-                      <w:color w:val="AD4426"/>
-                      <w:sz w:val="19"/>
-                      <w:szCs w:val="19"/>
-                    </w:rPr>
-                    <w:t xml:space="preserve">Pfeil 2:</w:t>
-                  </w:r>
-                </w:p>
-              </w:tc>
-            </w:tr>
-            <w:tr>
-              <w:tc>
-                <w:tcPr>
-                  <w:tcW w:type="dxa" w:w="3590"/>
-                  <w:tcBorders>
-                    <w:top w:val="none" w:color="FFFFFF" w:sz="0"/>
-                    <w:left w:val="none" w:color="FFFFFF" w:sz="0"/>
-                    <w:bottom w:val="single" w:color="BFB5A5" w:sz="4"/>
-                    <w:right w:val="none" w:color="FFFFFF" w:sz="0"/>
-                  </w:tcBorders>
-                  <w:tcMar>
-                    <w:top w:type="dxa" w:w="90"/>
-                    <w:left w:type="dxa" w:w="40"/>
-                    <w:bottom w:type="dxa" w:w="30"/>
-                    <w:right w:type="dxa" w:w="40"/>
-                  </w:tcMar>
-                </w:tcPr>
-                <w:p>
-                  <w:pPr>
-                    <w:spacing w:after="0" w:before="0"/>
-                  </w:pPr>
-                  <w:r>
-                    <w:rPr>
-                      <w:rFonts w:ascii="Calibri" w:cs="Calibri" w:eastAsia="Calibri" w:hAnsi="Calibri"/>
-                      <w:b/>
-                      <w:bCs/>
-                      <w:color w:val="AD4426"/>
-                      <w:sz w:val="19"/>
-                      <w:szCs w:val="19"/>
-                    </w:rPr>
-                    <w:t xml:space="preserve">Pfeil 3:</w:t>
-                  </w:r>
-                </w:p>
-              </w:tc>
-              <w:tc>
-                <w:tcPr>
-                  <w:tcW w:type="dxa" w:w="3590"/>
-                  <w:tcBorders>
-                    <w:top w:val="none" w:color="FFFFFF" w:sz="0"/>
-                    <w:left w:val="none" w:color="FFFFFF" w:sz="0"/>
-                    <w:bottom w:val="single" w:color="BFB5A5" w:sz="4"/>
-                    <w:right w:val="none" w:color="FFFFFF" w:sz="0"/>
-                  </w:tcBorders>
-                  <w:tcMar>
-                    <w:top w:type="dxa" w:w="90"/>
-                    <w:left w:type="dxa" w:w="40"/>
-                    <w:bottom w:type="dxa" w:w="30"/>
-                    <w:right w:type="dxa" w:w="40"/>
-                  </w:tcMar>
-                </w:tcPr>
-                <w:p>
-                  <w:pPr>
-                    <w:spacing w:after="0" w:before="0"/>
-                  </w:pPr>
-                  <w:r>
-                    <w:rPr>
-                      <w:rFonts w:ascii="Calibri" w:cs="Calibri" w:eastAsia="Calibri" w:hAnsi="Calibri"/>
-                      <w:b/>
-                      <w:bCs/>
-                      <w:color w:val="AD4426"/>
-                      <w:sz w:val="19"/>
-                      <w:szCs w:val="19"/>
-                    </w:rPr>
-                    <w:t xml:space="preserve">Pfeil 4:</w:t>
-                  </w:r>
-                </w:p>
-              </w:tc>
-            </w:tr>
-            <w:tr>
-              <w:tc>
-                <w:tcPr>
-                  <w:tcW w:type="dxa" w:w="3590"/>
-                  <w:tcBorders>
-                    <w:top w:val="none" w:color="FFFFFF" w:sz="0"/>
-                    <w:left w:val="none" w:color="FFFFFF" w:sz="0"/>
-                    <w:bottom w:val="single" w:color="BFB5A5" w:sz="4"/>
-                    <w:right w:val="none" w:color="FFFFFF" w:sz="0"/>
-                  </w:tcBorders>
-                  <w:tcMar>
-                    <w:top w:type="dxa" w:w="90"/>
-                    <w:left w:type="dxa" w:w="40"/>
-                    <w:bottom w:type="dxa" w:w="30"/>
-                    <w:right w:type="dxa" w:w="40"/>
-                  </w:tcMar>
-                </w:tcPr>
-                <w:p>
-                  <w:pPr>
-                    <w:spacing w:after="0" w:before="0"/>
-                  </w:pPr>
-                  <w:r>
-                    <w:rPr>
-                      <w:rFonts w:ascii="Calibri" w:cs="Calibri" w:eastAsia="Calibri" w:hAnsi="Calibri"/>
-                      <w:b/>
-                      <w:bCs/>
-                      <w:color w:val="AD4426"/>
-                      <w:sz w:val="19"/>
-                      <w:szCs w:val="19"/>
-                    </w:rPr>
-                    <w:t xml:space="preserve">Pfeil 5:</w:t>
-                  </w:r>
-                </w:p>
-              </w:tc>
-              <w:tc>
-                <w:tcPr>
-                  <w:tcW w:type="dxa" w:w="3590"/>
-                  <w:tcBorders>
-                    <w:top w:val="none" w:color="FFFFFF" w:sz="0"/>
-                    <w:left w:val="none" w:color="FFFFFF" w:sz="0"/>
-                    <w:bottom w:val="single" w:color="BFB5A5" w:sz="4"/>
-                    <w:right w:val="none" w:color="FFFFFF" w:sz="0"/>
-                  </w:tcBorders>
-                  <w:tcMar>
-                    <w:top w:type="dxa" w:w="90"/>
-                    <w:left w:type="dxa" w:w="40"/>
-                    <w:bottom w:type="dxa" w:w="30"/>
-                    <w:right w:type="dxa" w:w="40"/>
-                  </w:tcMar>
-                </w:tcPr>
-                <w:p>
-                  <w:pPr>
-                    <w:spacing w:after="0" w:before="0"/>
-                  </w:pPr>
-                  <w:r>
-                    <w:rPr>
-                      <w:rFonts w:ascii="Calibri" w:cs="Calibri" w:eastAsia="Calibri" w:hAnsi="Calibri"/>
-                      <w:b/>
-                      <w:bCs/>
-                      <w:color w:val="AD4426"/>
-                      <w:sz w:val="19"/>
-                      <w:szCs w:val="19"/>
-                    </w:rPr>
-                    <w:t xml:space="preserve"/>
-                  </w:r>
-                </w:p>
+                <w:p/>
               </w:tc>
             </w:tr>
           </w:tbl>
-          <w:p>
-            <w:pPr>
-              <w:spacing w:after="0" w:before="100"/>
-            </w:pPr>
-            <w:r>
-              <w:rPr>
-                <w:rFonts w:ascii="Calibri" w:cs="Calibri" w:eastAsia="Calibri" w:hAnsi="Calibri"/>
-                <w:b/>
-                <w:bCs/>
-                <w:color w:val="AD4426"/>
-                <w:sz w:val="19"/>
-                <w:szCs w:val="19"/>
-              </w:rPr>
-              <w:t xml:space="preserve">3. </w:t>
-            </w:r>
-            <w:r>
-              <w:rPr>
-                <w:rFonts w:ascii="Calibri" w:cs="Calibri" w:eastAsia="Calibri" w:hAnsi="Calibri"/>
-                <w:color w:val="2B2318"/>
-                <w:sz w:val="19"/>
-                <w:szCs w:val="19"/>
-              </w:rPr>
-              <w:t xml:space="preserve">Lykon ist Thete: Kreise grün ein, was er darf. Streiche rot durch, was er nicht darf.</w:t>
-            </w:r>
-          </w:p>
+          <w:p/>
         </w:tc>
       </w:tr>
     </w:tbl>

</xml_diff>